<commit_message>
dm-k3: results + remarks for sections 1-4, remarks row on every hub
</commit_message>
<xml_diff>
--- a/BGIL_DBT/validation/DM-K3.docx
+++ b/BGIL_DBT/validation/DM-K3.docx
@@ -484,11 +484,7 @@
           </w:tcPr>
           <w:p>
             <w:r>
-              <w:rPr>
-                <w:lang w:val="en-US"/>
-                <w:rtl w:val="off"/>
-              </w:rPr>
-              <w:t>Pass</w:t>
+              <w:t xml:space="preserve">Fail (ghost record only) — null-key check Pass</w:t>
             </w:r>
           </w:p>
         </w:tc>
@@ -511,7 +507,11 @@
           <w:tcPr>
             <w:tcW w:w="4320" w:type="dxa"/>
           </w:tcPr>
-          <w:p/>
+          <w:p>
+            <w:r>
+              <w:t xml:space="preserve">0</w:t>
+            </w:r>
+          </w:p>
         </w:tc>
       </w:tr>
       <w:tr>
@@ -534,11 +534,32 @@
           </w:tcPr>
           <w:p>
             <w:r>
-              <w:rPr>
-                <w:lang w:val="en-US"/>
-                <w:rtl w:val="off"/>
-              </w:rPr>
-              <w:t>Y(But the record is actual bussiness)</w:t>
+              <w:t xml:space="preserve">N</w:t>
+            </w:r>
+          </w:p>
+        </w:tc>
+      </w:tr>
+      <w:tr>
+        <w:tc>
+          <w:tcPr>
+            <w:tcW w:w="4320" w:type="dxa"/>
+          </w:tcPr>
+          <w:p>
+            <w:r>
+              <w:rPr>
+                <w:b/>
+              </w:rPr>
+              <w:t>Remarks</w:t>
+            </w:r>
+          </w:p>
+        </w:tc>
+        <w:tc>
+          <w:tcPr>
+            <w:tcW w:w="4320" w:type="dxa"/>
+          </w:tcPr>
+          <w:p>
+            <w:r>
+              <w:t xml:space="preserve">1,435,135 keys checked; 0 null hash keys, 0 null/blank business keys. Ghost record not present: ghost/-1 records are not implemented in the current model. Null source keys are excluded at load, so no null references exist. Raised as a documented exception. 1 business key = '0' (flagged by placeholder_bk_info): traced to PARTY_DETAIL, PARTY_CODE 0 = 'DIRECT BUSINESS' (organisation, ACTIVE), a genuine source master record referenced by 12 child rows. Valid key, not a ghost record; no action.</w:t>
             </w:r>
           </w:p>
         </w:tc>
@@ -924,7 +945,11 @@
           <w:tcPr>
             <w:tcW w:w="4320" w:type="dxa"/>
           </w:tcPr>
-          <w:p/>
+          <w:p>
+            <w:r>
+              <w:t xml:space="preserve">Fail (ghost record only) — null-key check Pass</w:t>
+            </w:r>
+          </w:p>
         </w:tc>
       </w:tr>
       <w:tr>
@@ -945,7 +970,11 @@
           <w:tcPr>
             <w:tcW w:w="4320" w:type="dxa"/>
           </w:tcPr>
-          <w:p/>
+          <w:p>
+            <w:r>
+              <w:t xml:space="preserve">0</w:t>
+            </w:r>
+          </w:p>
         </w:tc>
       </w:tr>
       <w:tr>
@@ -966,7 +995,36 @@
           <w:tcPr>
             <w:tcW w:w="4320" w:type="dxa"/>
           </w:tcPr>
-          <w:p/>
+          <w:p>
+            <w:r>
+              <w:t xml:space="preserve">N</w:t>
+            </w:r>
+          </w:p>
+        </w:tc>
+      </w:tr>
+      <w:tr>
+        <w:tc>
+          <w:tcPr>
+            <w:tcW w:w="4320" w:type="dxa"/>
+          </w:tcPr>
+          <w:p>
+            <w:r>
+              <w:rPr>
+                <w:b/>
+              </w:rPr>
+              <w:t>Remarks</w:t>
+            </w:r>
+          </w:p>
+        </w:tc>
+        <w:tc>
+          <w:tcPr>
+            <w:tcW w:w="4320" w:type="dxa"/>
+          </w:tcPr>
+          <w:p>
+            <w:r>
+              <w:t xml:space="preserve">7 keys checked; 0 null hash keys, 0 null/blank business keys, 0 placeholder keys. Ghost record not present: ghost/-1 records are not implemented in the current model. Null source keys are excluded at load, so no null references exist. Raised as a documented exception.</w:t>
+            </w:r>
+          </w:p>
         </w:tc>
       </w:tr>
     </w:tbl>
@@ -1317,7 +1375,11 @@
           <w:tcPr>
             <w:tcW w:w="4320" w:type="dxa"/>
           </w:tcPr>
-          <w:p/>
+          <w:p>
+            <w:r>
+              <w:t xml:space="preserve">Fail — defect: no Maximus keys loaded (null-key check passes only because hub is empty)</w:t>
+            </w:r>
+          </w:p>
         </w:tc>
       </w:tr>
       <w:tr>
@@ -1338,7 +1400,11 @@
           <w:tcPr>
             <w:tcW w:w="4320" w:type="dxa"/>
           </w:tcPr>
-          <w:p/>
+          <w:p>
+            <w:r>
+              <w:t xml:space="preserve">0 (0 rows in scope)</w:t>
+            </w:r>
+          </w:p>
         </w:tc>
       </w:tr>
       <w:tr>
@@ -1359,7 +1425,36 @@
           <w:tcPr>
             <w:tcW w:w="4320" w:type="dxa"/>
           </w:tcPr>
-          <w:p/>
+          <w:p>
+            <w:r>
+              <w:t xml:space="preserve">N</w:t>
+            </w:r>
+          </w:p>
+        </w:tc>
+      </w:tr>
+      <w:tr>
+        <w:tc>
+          <w:tcPr>
+            <w:tcW w:w="4320" w:type="dxa"/>
+          </w:tcPr>
+          <w:p>
+            <w:r>
+              <w:rPr>
+                <w:b/>
+              </w:rPr>
+              <w:t>Remarks</w:t>
+            </w:r>
+          </w:p>
+        </w:tc>
+        <w:tc>
+          <w:tcPr>
+            <w:tcW w:w="4320" w:type="dxa"/>
+          </w:tcPr>
+          <w:p>
+            <w:r>
+              <w:t xml:space="preserve">0 Maximus rows in HUB_LOCATION. DEFECT: LOCATION_BK = md5(concat_ws('|', &lt;address parts&gt;)); Snowflake concat_ws returns NULL if ANY part is NULL, so every key is NULL and the hub load drops the row. Traced on RAW: PARTY_ADDRESS 1,902,904 rows / 0 with key; ADDRESS_PROPERTY_PIVOT_VW 1,877,350 / 0; SIMPLE_PROPERTY_PIVOT_VW 1,440,906 / 0. Fix: null-safe key build in the Maximus generator (coalesce each part to '' before concat), then reload and re-test K1/K2/K3. Also affects LNK_PARTY_LOCATION / PARTY_LOCATION keys built from the same expression. Ghost record not implemented (documented exception, as other hubs).</w:t>
+            </w:r>
+          </w:p>
         </w:tc>
       </w:tr>
     </w:tbl>
@@ -1550,13 +1645,12 @@
           </w:tcPr>
           <w:p>
             <w:r>
-              <w:br/>
-            </w:r>
-            <w:r>
-              <w:br/>
-            </w:r>
-            <w:r>
-              <w:br/>
+              <w:t xml:space="preserve">project=MAXIMUS | hub=HUB_LOCATION | rows_in_scope=0 | null_hkey=0 | null_or_blank_bk=0 |</w:t>
+            </w:r>
+          </w:p>
+          <w:p>
+            <w:r>
+              <w:t xml:space="preserve">placeholder_bk_info=0 | ghost_rows=0 | null_key_status=PASS | ghost_record_status=FAIL</w:t>
             </w:r>
           </w:p>
         </w:tc>
@@ -1699,7 +1793,11 @@
           <w:tcPr>
             <w:tcW w:w="4320" w:type="dxa"/>
           </w:tcPr>
-          <w:p/>
+          <w:p>
+            <w:r>
+              <w:t xml:space="preserve">Fail (ghost record only) — null-key check Pass</w:t>
+            </w:r>
+          </w:p>
         </w:tc>
       </w:tr>
       <w:tr>
@@ -1720,7 +1818,11 @@
           <w:tcPr>
             <w:tcW w:w="4320" w:type="dxa"/>
           </w:tcPr>
-          <w:p/>
+          <w:p>
+            <w:r>
+              <w:t xml:space="preserve">0</w:t>
+            </w:r>
+          </w:p>
         </w:tc>
       </w:tr>
       <w:tr>
@@ -1741,7 +1843,36 @@
           <w:tcPr>
             <w:tcW w:w="4320" w:type="dxa"/>
           </w:tcPr>
-          <w:p/>
+          <w:p>
+            <w:r>
+              <w:t xml:space="preserve">N</w:t>
+            </w:r>
+          </w:p>
+        </w:tc>
+      </w:tr>
+      <w:tr>
+        <w:tc>
+          <w:tcPr>
+            <w:tcW w:w="4320" w:type="dxa"/>
+          </w:tcPr>
+          <w:p>
+            <w:r>
+              <w:rPr>
+                <w:b/>
+              </w:rPr>
+              <w:t>Remarks</w:t>
+            </w:r>
+          </w:p>
+        </w:tc>
+        <w:tc>
+          <w:tcPr>
+            <w:tcW w:w="4320" w:type="dxa"/>
+          </w:tcPr>
+          <w:p>
+            <w:r>
+              <w:t xml:space="preserve">265,238 keys checked; 0 null hash keys, 0 null/blank business keys, 0 prefix-only keys ('HUB_PAYMENT_INSTRUMENT|' with no FOREIGN_KEY), 0 placeholder keys. Ghost record not present: ghost/-1 records are not implemented in the current model. Null source keys are excluded at load, so no null references exist. Raised as a documented exception.</w:t>
+            </w:r>
+          </w:p>
         </w:tc>
       </w:tr>
     </w:tbl>
@@ -1957,13 +2088,12 @@
           </w:tcPr>
           <w:p>
             <w:r>
-              <w:br/>
-            </w:r>
-            <w:r>
-              <w:br/>
-            </w:r>
-            <w:r>
-              <w:br/>
+              <w:t xml:space="preserve">project=MAXIMUS | hub=HUB_PAYMENT_INSTRUMENT | rows_in_scope=265,238 | null_hkey=0 | null_or_blank_bk=0 |</w:t>
+            </w:r>
+          </w:p>
+          <w:p>
+            <w:r>
+              <w:t xml:space="preserve">prefix_only_bk=0 | placeholder_bk_info=0 | ghost_rows=0 | null_key_status=PASS | ghost_record_status=FAIL</w:t>
             </w:r>
           </w:p>
         </w:tc>
@@ -2151,6 +2281,27 @@
           <w:p/>
         </w:tc>
       </w:tr>
+      <w:tr>
+        <w:tc>
+          <w:tcPr>
+            <w:tcW w:w="4320" w:type="dxa"/>
+          </w:tcPr>
+          <w:p>
+            <w:r>
+              <w:rPr>
+                <w:b/>
+              </w:rPr>
+              <w:t>Remarks</w:t>
+            </w:r>
+          </w:p>
+        </w:tc>
+        <w:tc>
+          <w:tcPr>
+            <w:tcW w:w="4320" w:type="dxa"/>
+          </w:tcPr>
+          <w:p/>
+        </w:tc>
+      </w:tr>
     </w:tbl>
     <w:p/>
     <w:p>
@@ -2523,6 +2674,27 @@
                 <w:b/>
               </w:rPr>
               <w:t>Ghost record present (Y/N)</w:t>
+            </w:r>
+          </w:p>
+        </w:tc>
+        <w:tc>
+          <w:tcPr>
+            <w:tcW w:w="4320" w:type="dxa"/>
+          </w:tcPr>
+          <w:p/>
+        </w:tc>
+      </w:tr>
+      <w:tr>
+        <w:tc>
+          <w:tcPr>
+            <w:tcW w:w="4320" w:type="dxa"/>
+          </w:tcPr>
+          <w:p>
+            <w:r>
+              <w:rPr>
+                <w:b/>
+              </w:rPr>
+              <w:t>Remarks</w:t>
             </w:r>
           </w:p>
         </w:tc>
@@ -2926,6 +3098,27 @@
           <w:p/>
         </w:tc>
       </w:tr>
+      <w:tr>
+        <w:tc>
+          <w:tcPr>
+            <w:tcW w:w="4320" w:type="dxa"/>
+          </w:tcPr>
+          <w:p>
+            <w:r>
+              <w:rPr>
+                <w:b/>
+              </w:rPr>
+              <w:t>Remarks</w:t>
+            </w:r>
+          </w:p>
+        </w:tc>
+        <w:tc>
+          <w:tcPr>
+            <w:tcW w:w="4320" w:type="dxa"/>
+          </w:tcPr>
+          <w:p/>
+        </w:tc>
+      </w:tr>
     </w:tbl>
     <w:p/>
     <w:p>
@@ -3308,6 +3501,27 @@
           <w:p/>
         </w:tc>
       </w:tr>
+      <w:tr>
+        <w:tc>
+          <w:tcPr>
+            <w:tcW w:w="4320" w:type="dxa"/>
+          </w:tcPr>
+          <w:p>
+            <w:r>
+              <w:rPr>
+                <w:b/>
+              </w:rPr>
+              <w:t>Remarks</w:t>
+            </w:r>
+          </w:p>
+        </w:tc>
+        <w:tc>
+          <w:tcPr>
+            <w:tcW w:w="4320" w:type="dxa"/>
+          </w:tcPr>
+          <w:p/>
+        </w:tc>
+      </w:tr>
     </w:tbl>
     <w:p/>
     <w:p>
@@ -3690,6 +3904,27 @@
           <w:p/>
         </w:tc>
       </w:tr>
+      <w:tr>
+        <w:tc>
+          <w:tcPr>
+            <w:tcW w:w="4320" w:type="dxa"/>
+          </w:tcPr>
+          <w:p>
+            <w:r>
+              <w:rPr>
+                <w:b/>
+              </w:rPr>
+              <w:t>Remarks</w:t>
+            </w:r>
+          </w:p>
+        </w:tc>
+        <w:tc>
+          <w:tcPr>
+            <w:tcW w:w="4320" w:type="dxa"/>
+          </w:tcPr>
+          <w:p/>
+        </w:tc>
+      </w:tr>
     </w:tbl>
     <w:p/>
     <w:p>
@@ -4072,6 +4307,27 @@
           <w:p/>
         </w:tc>
       </w:tr>
+      <w:tr>
+        <w:tc>
+          <w:tcPr>
+            <w:tcW w:w="4320" w:type="dxa"/>
+          </w:tcPr>
+          <w:p>
+            <w:r>
+              <w:rPr>
+                <w:b/>
+              </w:rPr>
+              <w:t>Remarks</w:t>
+            </w:r>
+          </w:p>
+        </w:tc>
+        <w:tc>
+          <w:tcPr>
+            <w:tcW w:w="4320" w:type="dxa"/>
+          </w:tcPr>
+          <w:p/>
+        </w:tc>
+      </w:tr>
     </w:tbl>
     <w:p/>
     <w:p>
@@ -4454,6 +4710,27 @@
           <w:p/>
         </w:tc>
       </w:tr>
+      <w:tr>
+        <w:tc>
+          <w:tcPr>
+            <w:tcW w:w="4320" w:type="dxa"/>
+          </w:tcPr>
+          <w:p>
+            <w:r>
+              <w:rPr>
+                <w:b/>
+              </w:rPr>
+              <w:t>Remarks</w:t>
+            </w:r>
+          </w:p>
+        </w:tc>
+        <w:tc>
+          <w:tcPr>
+            <w:tcW w:w="4320" w:type="dxa"/>
+          </w:tcPr>
+          <w:p/>
+        </w:tc>
+      </w:tr>
     </w:tbl>
     <w:p/>
     <w:p>
@@ -4836,6 +5113,27 @@
           <w:p/>
         </w:tc>
       </w:tr>
+      <w:tr>
+        <w:tc>
+          <w:tcPr>
+            <w:tcW w:w="4320" w:type="dxa"/>
+          </w:tcPr>
+          <w:p>
+            <w:r>
+              <w:rPr>
+                <w:b/>
+              </w:rPr>
+              <w:t>Remarks</w:t>
+            </w:r>
+          </w:p>
+        </w:tc>
+        <w:tc>
+          <w:tcPr>
+            <w:tcW w:w="4320" w:type="dxa"/>
+          </w:tcPr>
+          <w:p/>
+        </w:tc>
+      </w:tr>
     </w:tbl>
     <w:p/>
     <w:p>
@@ -5218,6 +5516,27 @@
           <w:p/>
         </w:tc>
       </w:tr>
+      <w:tr>
+        <w:tc>
+          <w:tcPr>
+            <w:tcW w:w="4320" w:type="dxa"/>
+          </w:tcPr>
+          <w:p>
+            <w:r>
+              <w:rPr>
+                <w:b/>
+              </w:rPr>
+              <w:t>Remarks</w:t>
+            </w:r>
+          </w:p>
+        </w:tc>
+        <w:tc>
+          <w:tcPr>
+            <w:tcW w:w="4320" w:type="dxa"/>
+          </w:tcPr>
+          <w:p/>
+        </w:tc>
+      </w:tr>
     </w:tbl>
     <w:p/>
     <w:p>
@@ -5600,6 +5919,27 @@
           <w:p/>
         </w:tc>
       </w:tr>
+      <w:tr>
+        <w:tc>
+          <w:tcPr>
+            <w:tcW w:w="4320" w:type="dxa"/>
+          </w:tcPr>
+          <w:p>
+            <w:r>
+              <w:rPr>
+                <w:b/>
+              </w:rPr>
+              <w:t>Remarks</w:t>
+            </w:r>
+          </w:p>
+        </w:tc>
+        <w:tc>
+          <w:tcPr>
+            <w:tcW w:w="4320" w:type="dxa"/>
+          </w:tcPr>
+          <w:p/>
+        </w:tc>
+      </w:tr>
     </w:tbl>
     <w:p/>
     <w:p>
@@ -5982,6 +6322,27 @@
           <w:p/>
         </w:tc>
       </w:tr>
+      <w:tr>
+        <w:tc>
+          <w:tcPr>
+            <w:tcW w:w="4320" w:type="dxa"/>
+          </w:tcPr>
+          <w:p>
+            <w:r>
+              <w:rPr>
+                <w:b/>
+              </w:rPr>
+              <w:t>Remarks</w:t>
+            </w:r>
+          </w:p>
+        </w:tc>
+        <w:tc>
+          <w:tcPr>
+            <w:tcW w:w="4320" w:type="dxa"/>
+          </w:tcPr>
+          <w:p/>
+        </w:tc>
+      </w:tr>
     </w:tbl>
     <w:p/>
     <w:p>
@@ -6364,6 +6725,27 @@
           <w:p/>
         </w:tc>
       </w:tr>
+      <w:tr>
+        <w:tc>
+          <w:tcPr>
+            <w:tcW w:w="4320" w:type="dxa"/>
+          </w:tcPr>
+          <w:p>
+            <w:r>
+              <w:rPr>
+                <w:b/>
+              </w:rPr>
+              <w:t>Remarks</w:t>
+            </w:r>
+          </w:p>
+        </w:tc>
+        <w:tc>
+          <w:tcPr>
+            <w:tcW w:w="4320" w:type="dxa"/>
+          </w:tcPr>
+          <w:p/>
+        </w:tc>
+      </w:tr>
     </w:tbl>
     <w:p/>
     <w:p>
@@ -6746,6 +7128,27 @@
           <w:p/>
         </w:tc>
       </w:tr>
+      <w:tr>
+        <w:tc>
+          <w:tcPr>
+            <w:tcW w:w="4320" w:type="dxa"/>
+          </w:tcPr>
+          <w:p>
+            <w:r>
+              <w:rPr>
+                <w:b/>
+              </w:rPr>
+              <w:t>Remarks</w:t>
+            </w:r>
+          </w:p>
+        </w:tc>
+        <w:tc>
+          <w:tcPr>
+            <w:tcW w:w="4320" w:type="dxa"/>
+          </w:tcPr>
+          <w:p/>
+        </w:tc>
+      </w:tr>
     </w:tbl>
     <w:p/>
     <w:p>
@@ -7128,6 +7531,27 @@
           <w:p/>
         </w:tc>
       </w:tr>
+      <w:tr>
+        <w:tc>
+          <w:tcPr>
+            <w:tcW w:w="4320" w:type="dxa"/>
+          </w:tcPr>
+          <w:p>
+            <w:r>
+              <w:rPr>
+                <w:b/>
+              </w:rPr>
+              <w:t>Remarks</w:t>
+            </w:r>
+          </w:p>
+        </w:tc>
+        <w:tc>
+          <w:tcPr>
+            <w:tcW w:w="4320" w:type="dxa"/>
+          </w:tcPr>
+          <w:p/>
+        </w:tc>
+      </w:tr>
     </w:tbl>
     <w:p/>
     <w:p>
@@ -7510,6 +7934,27 @@
           <w:p/>
         </w:tc>
       </w:tr>
+      <w:tr>
+        <w:tc>
+          <w:tcPr>
+            <w:tcW w:w="4320" w:type="dxa"/>
+          </w:tcPr>
+          <w:p>
+            <w:r>
+              <w:rPr>
+                <w:b/>
+              </w:rPr>
+              <w:t>Remarks</w:t>
+            </w:r>
+          </w:p>
+        </w:tc>
+        <w:tc>
+          <w:tcPr>
+            <w:tcW w:w="4320" w:type="dxa"/>
+          </w:tcPr>
+          <w:p/>
+        </w:tc>
+      </w:tr>
     </w:tbl>
     <w:p/>
     <w:p>
@@ -7861,6 +8306,27 @@
                 <w:b/>
               </w:rPr>
               <w:t>Rows returned (count)</w:t>
+            </w:r>
+          </w:p>
+        </w:tc>
+        <w:tc>
+          <w:tcPr>
+            <w:tcW w:w="4320" w:type="dxa"/>
+          </w:tcPr>
+          <w:p/>
+        </w:tc>
+      </w:tr>
+      <w:tr>
+        <w:tc>
+          <w:tcPr>
+            <w:tcW w:w="4320" w:type="dxa"/>
+          </w:tcPr>
+          <w:p>
+            <w:r>
+              <w:rPr>
+                <w:b/>
+              </w:rPr>
+              <w:t>Remarks</w:t>
             </w:r>
           </w:p>
         </w:tc>

</xml_diff>